<commit_message>
feat: auto-preencher endereço por conjunto e remover testemunhas do formulário
</commit_message>
<xml_diff>
--- a/api/src/modules/processes/templates/kit-adjudicacao-base.docx
+++ b/api/src/modules/processes/templates/kit-adjudicacao-base.docx
@@ -831,7 +831,7 @@
           <w:szCs w:val="19"/>
         </w:rPr>
         <w:drawing>
-          <wp:anchor distT="0" distB="0" distL="0" distR="0" simplePos="0" relativeHeight="2" behindDoc="0" locked="0" layoutInCell="0" allowOverlap="1">
+          <wp:anchor distT="0" distB="0" distL="0" distR="0" simplePos="0" relativeHeight="6" behindDoc="0" locked="0" layoutInCell="0" allowOverlap="1">
             <wp:simplePos x="0" y="0"/>
             <wp:positionH relativeFrom="margin">
               <wp:align>center</wp:align>
@@ -953,22 +953,6 @@
         <w:pStyle w:val="Normal"/>
         <w:spacing w:lineRule="auto" w:line="240"/>
         <w:rPr>
-          <w:sz w:val="19"/>
-          <w:szCs w:val="19"/>
-        </w:rPr>
-      </w:pPr>
-      <w:r>
-        <w:rPr>
-          <w:sz w:val="19"/>
-          <w:szCs w:val="19"/>
-        </w:rPr>
-      </w:r>
-    </w:p>
-    <w:p>
-      <w:pPr>
-        <w:pStyle w:val="Normal"/>
-        <w:spacing w:lineRule="auto" w:line="240"/>
-        <w:rPr>
           <w:b/>
           <w:bCs/>
           <w:sz w:val="19"/>
@@ -990,89 +974,236 @@
         <w:pStyle w:val="Normal"/>
         <w:spacing w:lineRule="auto" w:line="240"/>
         <w:rPr>
-          <w:sz w:val="19"/>
-          <w:szCs w:val="19"/>
-        </w:rPr>
-      </w:pPr>
-      <w:r>
-        <w:rPr>
-          <w:sz w:val="19"/>
-          <w:szCs w:val="19"/>
-        </w:rPr>
-      </w:r>
-    </w:p>
-    <w:p>
-      <w:pPr>
-        <w:pStyle w:val="Normal"/>
-        <w:numPr>
-          <w:ilvl w:val="0"/>
-          <w:numId w:val="3"/>
-        </w:numPr>
-        <w:spacing w:lineRule="auto" w:line="240"/>
-        <w:rPr>
-          <w:sz w:val="19"/>
-          <w:szCs w:val="19"/>
-        </w:rPr>
-      </w:pPr>
-      <w:r>
-        <w:rPr>
-          <w:sz w:val="19"/>
-          <w:szCs w:val="19"/>
-        </w:rPr>
-        <w:t>{witness1Name} CPF: {witness1Cpf}</w:t>
-      </w:r>
-    </w:p>
-    <w:p>
-      <w:pPr>
-        <w:pStyle w:val="Normal"/>
-        <w:spacing w:lineRule="auto" w:line="240"/>
-        <w:ind w:start="720"/>
-        <w:rPr>
-          <w:sz w:val="19"/>
-          <w:szCs w:val="19"/>
-        </w:rPr>
-      </w:pPr>
-      <w:r>
-        <w:rPr>
-          <w:sz w:val="19"/>
-          <w:szCs w:val="19"/>
-        </w:rPr>
-      </w:r>
-    </w:p>
-    <w:p>
-      <w:pPr>
-        <w:pStyle w:val="ListParagraph"/>
-        <w:numPr>
-          <w:ilvl w:val="0"/>
-          <w:numId w:val="3"/>
-        </w:numPr>
-        <w:spacing w:lineRule="auto" w:line="240"/>
-        <w:rPr>
-          <w:sz w:val="19"/>
-          <w:szCs w:val="19"/>
-        </w:rPr>
-        <w:sectPr>
-          <w:headerReference w:type="default" r:id="rId4"/>
-          <w:type w:val="nextPage"/>
-          <w:pgSz w:w="11906" w:h="16838"/>
-          <w:pgMar w:left="1440" w:right="1440" w:gutter="0" w:header="851" w:top="1424" w:footer="0" w:bottom="851"/>
-          <w:pgNumType w:start="1" w:fmt="decimal"/>
-          <w:formProt w:val="false"/>
-          <w:textDirection w:val="lrTb"/>
-          <w:docGrid w:type="default" w:linePitch="100" w:charSpace="0"/>
-        </w:sectPr>
-      </w:pPr>
-      <w:r>
-        <w:rPr>
-          <w:sz w:val="19"/>
-          <w:szCs w:val="19"/>
-        </w:rPr>
-        <w:t>{witness2Name} CPF: {witness2Cpf}</w:t>
-      </w:r>
-      <w:r>
-        <w:br w:type="page"/>
-      </w:r>
-    </w:p>
+          <w:b/>
+          <w:bCs/>
+          <w:sz w:val="19"/>
+          <w:szCs w:val="19"/>
+        </w:rPr>
+      </w:pPr>
+      <w:r>
+        <w:rPr>
+          <w:b/>
+          <w:bCs/>
+          <w:sz w:val="19"/>
+          <w:szCs w:val="19"/>
+        </w:rPr>
+        <w:drawing>
+          <wp:anchor distT="0" distB="0" distL="0" distR="0" simplePos="0" relativeHeight="8" behindDoc="0" locked="0" layoutInCell="0" allowOverlap="1">
+            <wp:simplePos x="0" y="0"/>
+            <wp:positionH relativeFrom="column">
+              <wp:posOffset>972185</wp:posOffset>
+            </wp:positionH>
+            <wp:positionV relativeFrom="paragraph">
+              <wp:posOffset>65405</wp:posOffset>
+            </wp:positionV>
+            <wp:extent cx="757555" cy="485140"/>
+            <wp:effectExtent l="0" t="0" r="0" b="0"/>
+            <wp:wrapSquare wrapText="largest"/>
+            <wp:docPr id="2" name="Image2"/>
+            <wp:cNvGraphicFramePr>
+              <a:graphicFrameLocks xmlns:a="http://schemas.openxmlformats.org/drawingml/2006/main" noChangeAspect="1"/>
+            </wp:cNvGraphicFramePr>
+            <a:graphic xmlns:a="http://schemas.openxmlformats.org/drawingml/2006/main">
+              <a:graphicData uri="http://schemas.openxmlformats.org/drawingml/2006/picture">
+                <pic:pic xmlns:pic="http://schemas.openxmlformats.org/drawingml/2006/picture">
+                  <pic:nvPicPr>
+                    <pic:cNvPr id="2" name="Image2"/>
+                    <pic:cNvPicPr>
+                      <a:picLocks noChangeAspect="1" noChangeArrowheads="1"/>
+                    </pic:cNvPicPr>
+                  </pic:nvPicPr>
+                  <pic:blipFill>
+                    <a:blip r:embed="rId4"/>
+                    <a:stretch>
+                      <a:fillRect/>
+                    </a:stretch>
+                  </pic:blipFill>
+                  <pic:spPr bwMode="auto">
+                    <a:xfrm>
+                      <a:off x="0" y="0"/>
+                      <a:ext cx="757555" cy="485140"/>
+                    </a:xfrm>
+                    <a:prstGeom prst="rect">
+                      <a:avLst/>
+                    </a:prstGeom>
+                    <a:noFill/>
+                  </pic:spPr>
+                </pic:pic>
+              </a:graphicData>
+            </a:graphic>
+          </wp:anchor>
+        </w:drawing>
+        <w:drawing>
+          <wp:anchor distT="0" distB="0" distL="0" distR="0" simplePos="0" relativeHeight="9" behindDoc="0" locked="0" layoutInCell="0" allowOverlap="1">
+            <wp:simplePos x="0" y="0"/>
+            <wp:positionH relativeFrom="column">
+              <wp:posOffset>4031615</wp:posOffset>
+            </wp:positionH>
+            <wp:positionV relativeFrom="paragraph">
+              <wp:posOffset>52705</wp:posOffset>
+            </wp:positionV>
+            <wp:extent cx="441960" cy="479425"/>
+            <wp:effectExtent l="0" t="0" r="0" b="0"/>
+            <wp:wrapSquare wrapText="largest"/>
+            <wp:docPr id="3" name="Image3"/>
+            <wp:cNvGraphicFramePr>
+              <a:graphicFrameLocks xmlns:a="http://schemas.openxmlformats.org/drawingml/2006/main" noChangeAspect="1"/>
+            </wp:cNvGraphicFramePr>
+            <a:graphic xmlns:a="http://schemas.openxmlformats.org/drawingml/2006/main">
+              <a:graphicData uri="http://schemas.openxmlformats.org/drawingml/2006/picture">
+                <pic:pic xmlns:pic="http://schemas.openxmlformats.org/drawingml/2006/picture">
+                  <pic:nvPicPr>
+                    <pic:cNvPr id="3" name="Image3"/>
+                    <pic:cNvPicPr>
+                      <a:picLocks noChangeAspect="1" noChangeArrowheads="1"/>
+                    </pic:cNvPicPr>
+                  </pic:nvPicPr>
+                  <pic:blipFill>
+                    <a:blip r:embed="rId5"/>
+                    <a:stretch>
+                      <a:fillRect/>
+                    </a:stretch>
+                  </pic:blipFill>
+                  <pic:spPr bwMode="auto">
+                    <a:xfrm>
+                      <a:off x="0" y="0"/>
+                      <a:ext cx="441960" cy="479425"/>
+                    </a:xfrm>
+                    <a:prstGeom prst="rect">
+                      <a:avLst/>
+                    </a:prstGeom>
+                    <a:noFill/>
+                  </pic:spPr>
+                </pic:pic>
+              </a:graphicData>
+            </a:graphic>
+          </wp:anchor>
+        </w:drawing>
+      </w:r>
+    </w:p>
+    <w:p>
+      <w:pPr>
+        <w:pStyle w:val="Normal"/>
+        <w:spacing w:lineRule="auto" w:line="240"/>
+        <w:rPr>
+          <w:b/>
+          <w:bCs/>
+          <w:sz w:val="19"/>
+          <w:szCs w:val="19"/>
+        </w:rPr>
+      </w:pPr>
+      <w:r>
+        <w:rPr>
+          <w:b/>
+          <w:bCs/>
+          <w:sz w:val="19"/>
+          <w:szCs w:val="19"/>
+        </w:rPr>
+      </w:r>
+    </w:p>
+    <w:p>
+      <w:pPr>
+        <w:pStyle w:val="Normal"/>
+        <w:spacing w:lineRule="auto" w:line="240"/>
+        <w:rPr>
+          <w:b/>
+          <w:bCs/>
+          <w:sz w:val="19"/>
+          <w:szCs w:val="19"/>
+        </w:rPr>
+      </w:pPr>
+      <w:r>
+        <w:rPr>
+          <w:b/>
+          <w:bCs/>
+          <w:sz w:val="19"/>
+          <w:szCs w:val="19"/>
+        </w:rPr>
+      </w:r>
+    </w:p>
+    <w:p>
+      <w:pPr>
+        <w:pStyle w:val="Normal"/>
+        <w:spacing w:lineRule="auto" w:line="240"/>
+        <w:rPr>
+          <w:b/>
+          <w:bCs/>
+          <w:sz w:val="19"/>
+          <w:szCs w:val="19"/>
+        </w:rPr>
+      </w:pPr>
+      <w:r>
+        <w:rPr>
+          <w:sz w:val="19"/>
+          <w:szCs w:val="19"/>
+        </w:rPr>
+      </w:r>
+    </w:p>
+    <w:tbl>
+      <w:tblPr>
+        <w:tblW w:w="5000" w:type="pct"/>
+        <w:jc w:val="start"/>
+        <w:tblInd w:w="0" w:type="dxa"/>
+        <w:tblLayout w:type="fixed"/>
+        <w:tblCellMar>
+          <w:top w:w="55" w:type="dxa"/>
+          <w:start w:w="55" w:type="dxa"/>
+          <w:bottom w:w="55" w:type="dxa"/>
+          <w:end w:w="55" w:type="dxa"/>
+        </w:tblCellMar>
+      </w:tblPr>
+      <w:tblGrid>
+        <w:gridCol w:w="4512"/>
+        <w:gridCol w:w="4514"/>
+      </w:tblGrid>
+      <w:tr>
+        <w:trPr/>
+        <w:tc>
+          <w:tcPr>
+            <w:tcW w:w="4512" w:type="dxa"/>
+            <w:tcBorders/>
+          </w:tcPr>
+          <w:p>
+            <w:pPr>
+              <w:pStyle w:val="TableContents"/>
+              <w:rPr>
+                <w:sz w:val="14"/>
+                <w:szCs w:val="14"/>
+              </w:rPr>
+            </w:pPr>
+            <w:r>
+              <w:rPr>
+                <w:sz w:val="14"/>
+                <w:szCs w:val="14"/>
+              </w:rPr>
+              <w:t xml:space="preserve">1. WALTER TADEU BARROS BRASIL CPF: 003.058.522-80 </w:t>
+            </w:r>
+          </w:p>
+        </w:tc>
+        <w:tc>
+          <w:tcPr>
+            <w:tcW w:w="4514" w:type="dxa"/>
+            <w:tcBorders/>
+          </w:tcPr>
+          <w:p>
+            <w:pPr>
+              <w:pStyle w:val="TableContents"/>
+              <w:rPr>
+                <w:sz w:val="14"/>
+                <w:szCs w:val="14"/>
+              </w:rPr>
+            </w:pPr>
+            <w:r>
+              <w:rPr>
+                <w:sz w:val="14"/>
+                <w:szCs w:val="14"/>
+              </w:rPr>
+              <w:t>2. FRANCISCO WILOMAR SALES E SILVA CPF: 286.894.373-04</w:t>
+            </w:r>
+          </w:p>
+        </w:tc>
+      </w:tr>
+    </w:tbl>
     <w:p>
       <w:pPr>
         <w:pStyle w:val="Normal"/>
@@ -1092,6 +1223,30 @@
           <w:sz w:val="19"/>
           <w:szCs w:val="19"/>
         </w:rPr>
+      </w:r>
+      <w:r>
+        <w:br w:type="page"/>
+      </w:r>
+    </w:p>
+    <w:p>
+      <w:pPr>
+        <w:pStyle w:val="Normal"/>
+        <w:spacing w:lineRule="auto" w:line="240" w:before="0" w:after="0"/>
+        <w:jc w:val="center"/>
+        <w:rPr>
+          <w:b/>
+          <w:bCs/>
+          <w:sz w:val="19"/>
+          <w:szCs w:val="19"/>
+        </w:rPr>
+      </w:pPr>
+      <w:r>
+        <w:rPr>
+          <w:b/>
+          <w:bCs/>
+          <w:sz w:val="19"/>
+          <w:szCs w:val="19"/>
+        </w:rPr>
         <w:t>CONTRATO DE PRESTAÇÃO DE SERVIÇOS ADVOCATÍCIOS</w:t>
       </w:r>
     </w:p>
@@ -1223,7 +1378,7 @@
         </w:rPr>
         <w:t xml:space="preserve">, brasileiro, casado, advogado inscrito na OAB/SC nº 72.670 e economista no Corecon/SC nº 2.901, CPF nº 551.600.855-72, com escritório na Av. Mauro Ramos, 1409, Sala 902, Centro, Florianópolis/SC, e-mail </w:t>
       </w:r>
-      <w:hyperlink r:id="rId5">
+      <w:hyperlink r:id="rId6">
         <w:r>
           <w:rPr>
             <w:rStyle w:val="Style3"/>
@@ -1902,7 +2057,7 @@
           <w:szCs w:val="19"/>
         </w:rPr>
         <w:drawing>
-          <wp:anchor distT="0" distB="0" distL="0" distR="0" simplePos="0" relativeHeight="3" behindDoc="0" locked="0" layoutInCell="0" allowOverlap="1">
+          <wp:anchor distT="0" distB="0" distL="0" distR="0" simplePos="0" relativeHeight="7" behindDoc="0" locked="0" layoutInCell="0" allowOverlap="1">
             <wp:simplePos x="0" y="0"/>
             <wp:positionH relativeFrom="margin">
               <wp:align>center</wp:align>
@@ -1913,7 +2068,7 @@
             <wp:extent cx="609600" cy="521335"/>
             <wp:effectExtent l="0" t="0" r="0" b="0"/>
             <wp:wrapNone/>
-            <wp:docPr id="3" name="Imagem 1 Copy 1"/>
+            <wp:docPr id="4" name="Imagem 1 Copy 1"/>
             <wp:cNvGraphicFramePr>
               <a:graphicFrameLocks xmlns:a="http://schemas.openxmlformats.org/drawingml/2006/main" noChangeAspect="1"/>
             </wp:cNvGraphicFramePr>
@@ -1921,13 +2076,13 @@
               <a:graphicData uri="http://schemas.openxmlformats.org/drawingml/2006/picture">
                 <pic:pic xmlns:pic="http://schemas.openxmlformats.org/drawingml/2006/picture">
                   <pic:nvPicPr>
-                    <pic:cNvPr id="3" name="Imagem 1 Copy 1"/>
+                    <pic:cNvPr id="4" name="Imagem 1 Copy 1"/>
                     <pic:cNvPicPr>
                       <a:picLocks noChangeAspect="1" noChangeArrowheads="1"/>
                     </pic:cNvPicPr>
                   </pic:nvPicPr>
                   <pic:blipFill>
-                    <a:blip r:embed="rId6"/>
+                    <a:blip r:embed="rId7"/>
                     <a:stretch>
                       <a:fillRect/>
                     </a:stretch>
@@ -2024,22 +2179,6 @@
         <w:pStyle w:val="Normal"/>
         <w:spacing w:lineRule="auto" w:line="240"/>
         <w:rPr>
-          <w:sz w:val="19"/>
-          <w:szCs w:val="19"/>
-        </w:rPr>
-      </w:pPr>
-      <w:r>
-        <w:rPr>
-          <w:sz w:val="19"/>
-          <w:szCs w:val="19"/>
-        </w:rPr>
-      </w:r>
-    </w:p>
-    <w:p>
-      <w:pPr>
-        <w:pStyle w:val="Normal"/>
-        <w:spacing w:lineRule="auto" w:line="240"/>
-        <w:rPr>
           <w:b/>
           <w:bCs/>
           <w:sz w:val="19"/>
@@ -2060,98 +2199,237 @@
       <w:pPr>
         <w:pStyle w:val="Normal"/>
         <w:spacing w:lineRule="auto" w:line="240"/>
-        <w:ind w:hanging="0" w:start="720"/>
-        <w:rPr>
-          <w:sz w:val="19"/>
-          <w:szCs w:val="19"/>
-        </w:rPr>
-      </w:pPr>
-      <w:r>
-        <w:rPr>
-          <w:sz w:val="19"/>
-          <w:szCs w:val="19"/>
-        </w:rPr>
-      </w:r>
-    </w:p>
-    <w:p>
-      <w:pPr>
-        <w:pStyle w:val="Normal"/>
-        <w:numPr>
-          <w:ilvl w:val="0"/>
-          <w:numId w:val="4"/>
-        </w:numPr>
-        <w:spacing w:lineRule="auto" w:line="240"/>
-        <w:rPr>
-          <w:sz w:val="19"/>
-          <w:szCs w:val="19"/>
-        </w:rPr>
-      </w:pPr>
-      <w:r>
-        <w:rPr>
-          <w:sz w:val="19"/>
-          <w:szCs w:val="19"/>
-        </w:rPr>
-        <w:t>{witness1Name} CPF: {witness1Cpf}</w:t>
-      </w:r>
-    </w:p>
-    <w:p>
-      <w:pPr>
-        <w:pStyle w:val="Normal"/>
-        <w:spacing w:lineRule="auto" w:line="240"/>
-        <w:ind w:hanging="0" w:start="720"/>
-        <w:rPr>
-          <w:sz w:val="19"/>
-          <w:szCs w:val="19"/>
-        </w:rPr>
-      </w:pPr>
-      <w:r>
-        <w:rPr>
-          <w:sz w:val="19"/>
-          <w:szCs w:val="19"/>
-        </w:rPr>
-      </w:r>
-    </w:p>
-    <w:p>
-      <w:pPr>
-        <w:pStyle w:val="ListParagraph"/>
-        <w:numPr>
-          <w:ilvl w:val="0"/>
-          <w:numId w:val="4"/>
-        </w:numPr>
-        <w:spacing w:lineRule="auto" w:line="240"/>
-        <w:rPr>
-          <w:sz w:val="19"/>
-          <w:szCs w:val="19"/>
-        </w:rPr>
-      </w:pPr>
-      <w:r>
-        <w:rPr>
-          <w:sz w:val="19"/>
-          <w:szCs w:val="19"/>
-        </w:rPr>
-        <w:t>{witness2Name} CPF: {witness2Cpf}</w:t>
-      </w:r>
-    </w:p>
-    <w:p>
-      <w:pPr>
-        <w:pStyle w:val="Normal"/>
-        <w:spacing w:lineRule="auto" w:line="240"/>
-        <w:rPr>
-          <w:b/>
-          <w:bCs/>
-          <w:sz w:val="19"/>
-          <w:szCs w:val="19"/>
-        </w:rPr>
-      </w:pPr>
-      <w:r>
-        <w:rPr>
-          <w:b/>
-          <w:bCs/>
-          <w:sz w:val="19"/>
-          <w:szCs w:val="19"/>
-        </w:rPr>
-      </w:r>
-    </w:p>
+        <w:rPr>
+          <w:b/>
+          <w:bCs/>
+          <w:sz w:val="19"/>
+          <w:szCs w:val="19"/>
+        </w:rPr>
+      </w:pPr>
+      <w:r>
+        <w:rPr>
+          <w:b/>
+          <w:bCs/>
+          <w:sz w:val="19"/>
+          <w:szCs w:val="19"/>
+        </w:rPr>
+        <w:drawing>
+          <wp:anchor distT="0" distB="0" distL="0" distR="0" simplePos="0" relativeHeight="10" behindDoc="0" locked="0" layoutInCell="0" allowOverlap="1">
+            <wp:simplePos x="0" y="0"/>
+            <wp:positionH relativeFrom="column">
+              <wp:posOffset>972185</wp:posOffset>
+            </wp:positionH>
+            <wp:positionV relativeFrom="paragraph">
+              <wp:posOffset>65405</wp:posOffset>
+            </wp:positionV>
+            <wp:extent cx="757555" cy="485140"/>
+            <wp:effectExtent l="0" t="0" r="0" b="0"/>
+            <wp:wrapSquare wrapText="largest"/>
+            <wp:docPr id="5" name="Image2 Copy 1"/>
+            <wp:cNvGraphicFramePr>
+              <a:graphicFrameLocks xmlns:a="http://schemas.openxmlformats.org/drawingml/2006/main" noChangeAspect="1"/>
+            </wp:cNvGraphicFramePr>
+            <a:graphic xmlns:a="http://schemas.openxmlformats.org/drawingml/2006/main">
+              <a:graphicData uri="http://schemas.openxmlformats.org/drawingml/2006/picture">
+                <pic:pic xmlns:pic="http://schemas.openxmlformats.org/drawingml/2006/picture">
+                  <pic:nvPicPr>
+                    <pic:cNvPr id="5" name="Image2 Copy 1"/>
+                    <pic:cNvPicPr>
+                      <a:picLocks noChangeAspect="1" noChangeArrowheads="1"/>
+                    </pic:cNvPicPr>
+                  </pic:nvPicPr>
+                  <pic:blipFill>
+                    <a:blip r:embed="rId8"/>
+                    <a:stretch>
+                      <a:fillRect/>
+                    </a:stretch>
+                  </pic:blipFill>
+                  <pic:spPr bwMode="auto">
+                    <a:xfrm>
+                      <a:off x="0" y="0"/>
+                      <a:ext cx="757555" cy="485140"/>
+                    </a:xfrm>
+                    <a:prstGeom prst="rect">
+                      <a:avLst/>
+                    </a:prstGeom>
+                    <a:noFill/>
+                  </pic:spPr>
+                </pic:pic>
+              </a:graphicData>
+            </a:graphic>
+          </wp:anchor>
+        </w:drawing>
+        <w:drawing>
+          <wp:anchor distT="0" distB="0" distL="0" distR="0" simplePos="0" relativeHeight="11" behindDoc="0" locked="0" layoutInCell="0" allowOverlap="1">
+            <wp:simplePos x="0" y="0"/>
+            <wp:positionH relativeFrom="column">
+              <wp:posOffset>4031615</wp:posOffset>
+            </wp:positionH>
+            <wp:positionV relativeFrom="paragraph">
+              <wp:posOffset>52705</wp:posOffset>
+            </wp:positionV>
+            <wp:extent cx="441960" cy="479425"/>
+            <wp:effectExtent l="0" t="0" r="0" b="0"/>
+            <wp:wrapSquare wrapText="largest"/>
+            <wp:docPr id="6" name="Image3 Copy 1"/>
+            <wp:cNvGraphicFramePr>
+              <a:graphicFrameLocks xmlns:a="http://schemas.openxmlformats.org/drawingml/2006/main" noChangeAspect="1"/>
+            </wp:cNvGraphicFramePr>
+            <a:graphic xmlns:a="http://schemas.openxmlformats.org/drawingml/2006/main">
+              <a:graphicData uri="http://schemas.openxmlformats.org/drawingml/2006/picture">
+                <pic:pic xmlns:pic="http://schemas.openxmlformats.org/drawingml/2006/picture">
+                  <pic:nvPicPr>
+                    <pic:cNvPr id="6" name="Image3 Copy 1"/>
+                    <pic:cNvPicPr>
+                      <a:picLocks noChangeAspect="1" noChangeArrowheads="1"/>
+                    </pic:cNvPicPr>
+                  </pic:nvPicPr>
+                  <pic:blipFill>
+                    <a:blip r:embed="rId9"/>
+                    <a:stretch>
+                      <a:fillRect/>
+                    </a:stretch>
+                  </pic:blipFill>
+                  <pic:spPr bwMode="auto">
+                    <a:xfrm>
+                      <a:off x="0" y="0"/>
+                      <a:ext cx="441960" cy="479425"/>
+                    </a:xfrm>
+                    <a:prstGeom prst="rect">
+                      <a:avLst/>
+                    </a:prstGeom>
+                    <a:noFill/>
+                  </pic:spPr>
+                </pic:pic>
+              </a:graphicData>
+            </a:graphic>
+          </wp:anchor>
+        </w:drawing>
+      </w:r>
+    </w:p>
+    <w:p>
+      <w:pPr>
+        <w:pStyle w:val="Normal"/>
+        <w:spacing w:lineRule="auto" w:line="240"/>
+        <w:rPr>
+          <w:b/>
+          <w:bCs/>
+          <w:sz w:val="19"/>
+          <w:szCs w:val="19"/>
+        </w:rPr>
+      </w:pPr>
+      <w:r>
+        <w:rPr>
+          <w:b/>
+          <w:bCs/>
+          <w:sz w:val="19"/>
+          <w:szCs w:val="19"/>
+        </w:rPr>
+      </w:r>
+    </w:p>
+    <w:p>
+      <w:pPr>
+        <w:pStyle w:val="Normal"/>
+        <w:spacing w:lineRule="auto" w:line="240"/>
+        <w:rPr>
+          <w:b/>
+          <w:bCs/>
+          <w:sz w:val="19"/>
+          <w:szCs w:val="19"/>
+        </w:rPr>
+      </w:pPr>
+      <w:r>
+        <w:rPr>
+          <w:b/>
+          <w:bCs/>
+          <w:sz w:val="19"/>
+          <w:szCs w:val="19"/>
+        </w:rPr>
+      </w:r>
+    </w:p>
+    <w:p>
+      <w:pPr>
+        <w:pStyle w:val="Normal"/>
+        <w:spacing w:lineRule="auto" w:line="240"/>
+        <w:rPr>
+          <w:b/>
+          <w:bCs/>
+          <w:sz w:val="19"/>
+          <w:szCs w:val="19"/>
+        </w:rPr>
+      </w:pPr>
+      <w:r>
+        <w:rPr>
+          <w:sz w:val="19"/>
+          <w:szCs w:val="19"/>
+        </w:rPr>
+      </w:r>
+    </w:p>
+    <w:tbl>
+      <w:tblPr>
+        <w:tblW w:w="5000" w:type="pct"/>
+        <w:jc w:val="start"/>
+        <w:tblInd w:w="0" w:type="dxa"/>
+        <w:tblLayout w:type="fixed"/>
+        <w:tblCellMar>
+          <w:top w:w="55" w:type="dxa"/>
+          <w:start w:w="55" w:type="dxa"/>
+          <w:bottom w:w="55" w:type="dxa"/>
+          <w:end w:w="55" w:type="dxa"/>
+        </w:tblCellMar>
+      </w:tblPr>
+      <w:tblGrid>
+        <w:gridCol w:w="4512"/>
+        <w:gridCol w:w="4514"/>
+      </w:tblGrid>
+      <w:tr>
+        <w:trPr/>
+        <w:tc>
+          <w:tcPr>
+            <w:tcW w:w="4512" w:type="dxa"/>
+            <w:tcBorders/>
+          </w:tcPr>
+          <w:p>
+            <w:pPr>
+              <w:pStyle w:val="TableContents"/>
+              <w:rPr>
+                <w:sz w:val="14"/>
+                <w:szCs w:val="14"/>
+              </w:rPr>
+            </w:pPr>
+            <w:r>
+              <w:rPr>
+                <w:sz w:val="14"/>
+                <w:szCs w:val="14"/>
+              </w:rPr>
+              <w:t xml:space="preserve">1. WALTER TADEU BARROS BRASIL CPF: 003.058.522-80 </w:t>
+            </w:r>
+          </w:p>
+        </w:tc>
+        <w:tc>
+          <w:tcPr>
+            <w:tcW w:w="4514" w:type="dxa"/>
+            <w:tcBorders/>
+          </w:tcPr>
+          <w:p>
+            <w:pPr>
+              <w:pStyle w:val="TableContents"/>
+              <w:rPr>
+                <w:sz w:val="14"/>
+                <w:szCs w:val="14"/>
+              </w:rPr>
+            </w:pPr>
+            <w:r>
+              <w:rPr>
+                <w:sz w:val="14"/>
+                <w:szCs w:val="14"/>
+              </w:rPr>
+              <w:t>2. FRANCISCO WILOMAR SALES E SILVA CPF: 286.894.373-04</w:t>
+            </w:r>
+          </w:p>
+        </w:tc>
+      </w:tr>
+    </w:tbl>
     <w:p>
       <w:pPr>
         <w:pStyle w:val="Normal"/>
@@ -2170,9 +2448,12 @@
           <w:rFonts w:eastAsia="Calibri" w:cs="Calibri" w:ascii="Calibri" w:hAnsi="Calibri"/>
           <w:b/>
           <w:bCs/>
-          <w:sz w:val="24"/>
-          <w:szCs w:val="24"/>
-        </w:rPr>
+          <w:sz w:val="19"/>
+          <w:szCs w:val="19"/>
+        </w:rPr>
+      </w:r>
+      <w:r>
+        <w:br w:type="page"/>
       </w:r>
     </w:p>
     <w:p>
@@ -2196,7 +2477,6 @@
           <w:sz w:val="24"/>
           <w:szCs w:val="24"/>
         </w:rPr>
-        <w:br/>
         <w:t>PROCURAÇÃO AD JUDICIA ET EXTRA</w:t>
       </w:r>
     </w:p>
@@ -2340,7 +2620,7 @@
         <w:br/>
         <w:t xml:space="preserve">Gean Iamarque Izidio de Lima, brasileiro, casado, advogado e economista, inscrito na OAB/SC sob nº 72.670 e no Corecon/SC sob nº 2.901, CPF nº 551.600.855-72, com endereço profissional na Av. Mauro Ramos, 1409, Sala 902, Centro, Florianópolis/SC, CEP 88020-303, e-mail </w:t>
       </w:r>
-      <w:hyperlink r:id="rId7">
+      <w:hyperlink r:id="rId10">
         <w:r>
           <w:rPr>
             <w:rStyle w:val="Style3"/>
@@ -2599,7 +2879,7 @@
         <w:pStyle w:val="Normal"/>
         <w:numPr>
           <w:ilvl w:val="0"/>
-          <w:numId w:val="2"/>
+          <w:numId w:val="1"/>
         </w:numPr>
         <w:spacing w:lineRule="auto" w:line="278" w:before="0" w:after="160"/>
         <w:jc w:val="both"/>
@@ -2621,7 +2901,7 @@
         <w:pStyle w:val="Normal"/>
         <w:numPr>
           <w:ilvl w:val="0"/>
-          <w:numId w:val="2"/>
+          <w:numId w:val="1"/>
         </w:numPr>
         <w:spacing w:lineRule="auto" w:line="278" w:before="0" w:after="160"/>
         <w:jc w:val="both"/>
@@ -2643,7 +2923,7 @@
         <w:pStyle w:val="Normal"/>
         <w:numPr>
           <w:ilvl w:val="0"/>
-          <w:numId w:val="2"/>
+          <w:numId w:val="1"/>
         </w:numPr>
         <w:spacing w:lineRule="auto" w:line="278" w:before="0" w:after="160"/>
         <w:jc w:val="both"/>
@@ -2808,8 +3088,9 @@
       </w:r>
     </w:p>
     <w:sectPr>
-      <w:headerReference w:type="default" r:id="rId8"/>
-      <w:headerReference w:type="first" r:id="rId9"/>
+      <w:headerReference w:type="even" r:id="rId11"/>
+      <w:headerReference w:type="default" r:id="rId12"/>
+      <w:headerReference w:type="first" r:id="rId13"/>
       <w:type w:val="nextPage"/>
       <w:pgSz w:w="11906" w:h="16838"/>
       <w:pgMar w:left="1440" w:right="1440" w:gutter="0" w:header="851" w:top="1424" w:footer="0" w:bottom="851"/>
@@ -2831,52 +3112,6 @@
     </w:pPr>
     <w:r>
       <w:rPr/>
-      <w:drawing>
-        <wp:anchor distT="0" distB="0" distL="0" distR="0" simplePos="0" relativeHeight="7" behindDoc="0" locked="0" layoutInCell="0" allowOverlap="1">
-          <wp:simplePos x="0" y="0"/>
-          <wp:positionH relativeFrom="column">
-            <wp:posOffset>1598930</wp:posOffset>
-          </wp:positionH>
-          <wp:positionV relativeFrom="paragraph">
-            <wp:posOffset>-416560</wp:posOffset>
-          </wp:positionV>
-          <wp:extent cx="2877185" cy="629285"/>
-          <wp:effectExtent l="0" t="0" r="0" b="0"/>
-          <wp:wrapSquare wrapText="largest"/>
-          <wp:docPr id="2" name="Image1 Copy 1"/>
-          <wp:cNvGraphicFramePr>
-            <a:graphicFrameLocks xmlns:a="http://schemas.openxmlformats.org/drawingml/2006/main" noChangeAspect="1"/>
-          </wp:cNvGraphicFramePr>
-          <a:graphic xmlns:a="http://schemas.openxmlformats.org/drawingml/2006/main">
-            <a:graphicData uri="http://schemas.openxmlformats.org/drawingml/2006/picture">
-              <pic:pic xmlns:pic="http://schemas.openxmlformats.org/drawingml/2006/picture">
-                <pic:nvPicPr>
-                  <pic:cNvPr id="2" name="Image1 Copy 1"/>
-                  <pic:cNvPicPr>
-                    <a:picLocks noChangeAspect="1" noChangeArrowheads="1"/>
-                  </pic:cNvPicPr>
-                </pic:nvPicPr>
-                <pic:blipFill>
-                  <a:blip r:embed="rId1"/>
-                  <a:stretch>
-                    <a:fillRect/>
-                  </a:stretch>
-                </pic:blipFill>
-                <pic:spPr bwMode="auto">
-                  <a:xfrm>
-                    <a:off x="0" y="0"/>
-                    <a:ext cx="2877185" cy="629285"/>
-                  </a:xfrm>
-                  <a:prstGeom prst="rect">
-                    <a:avLst/>
-                  </a:prstGeom>
-                  <a:noFill/>
-                </pic:spPr>
-              </pic:pic>
-            </a:graphicData>
-          </a:graphic>
-        </wp:anchor>
-      </w:drawing>
     </w:r>
   </w:p>
 </w:hdr>
@@ -2892,7 +3127,7 @@
     <w:r>
       <w:rPr/>
       <w:drawing>
-        <wp:anchor distT="0" distB="0" distL="0" distR="0" simplePos="0" relativeHeight="6" behindDoc="0" locked="0" layoutInCell="0" allowOverlap="1">
+        <wp:anchor distT="0" distB="0" distL="0" distR="0" simplePos="0" relativeHeight="5" behindDoc="1" locked="0" layoutInCell="0" allowOverlap="1">
           <wp:simplePos x="0" y="0"/>
           <wp:positionH relativeFrom="column">
             <wp:posOffset>1598930</wp:posOffset>
@@ -2903,7 +3138,7 @@
           <wp:extent cx="2877185" cy="629285"/>
           <wp:effectExtent l="0" t="0" r="0" b="0"/>
           <wp:wrapSquare wrapText="largest"/>
-          <wp:docPr id="4" name="Image1"/>
+          <wp:docPr id="7" name="Image1 Copy 1"/>
           <wp:cNvGraphicFramePr>
             <a:graphicFrameLocks xmlns:a="http://schemas.openxmlformats.org/drawingml/2006/main" noChangeAspect="1"/>
           </wp:cNvGraphicFramePr>
@@ -2911,7 +3146,7 @@
             <a:graphicData uri="http://schemas.openxmlformats.org/drawingml/2006/picture">
               <pic:pic xmlns:pic="http://schemas.openxmlformats.org/drawingml/2006/picture">
                 <pic:nvPicPr>
-                  <pic:cNvPr id="4" name="Image1"/>
+                  <pic:cNvPr id="7" name="Image1 Copy 1"/>
                   <pic:cNvPicPr>
                     <a:picLocks noChangeAspect="1" noChangeArrowheads="1"/>
                   </pic:cNvPicPr>
@@ -2944,132 +3179,67 @@
 
 <file path=word/header3.xml><?xml version="1.0" encoding="utf-8"?>
 <w:hdr xmlns:o="urn:schemas-microsoft-com:office:office" xmlns:r="http://schemas.openxmlformats.org/officeDocument/2006/relationships" xmlns:v="urn:schemas-microsoft-com:vml" xmlns:w="http://schemas.openxmlformats.org/wordprocessingml/2006/main" xmlns:w10="urn:schemas-microsoft-com:office:word" xmlns:wp="http://schemas.openxmlformats.org/drawingml/2006/wordprocessingDrawing" xmlns:pic="http://schemas.openxmlformats.org/drawingml/2006/picture" xmlns:wps="http://schemas.microsoft.com/office/word/2010/wordprocessingShape" xmlns:wpg="http://schemas.microsoft.com/office/word/2010/wordprocessingGroup" xmlns:mc="http://schemas.openxmlformats.org/markup-compatibility/2006" xmlns:wp14="http://schemas.microsoft.com/office/word/2010/wordprocessingDrawing" xmlns:w14="http://schemas.microsoft.com/office/word/2010/wordml" xmlns:w15="http://schemas.microsoft.com/office/word/2012/wordml" mc:Ignorable="w14 wp14 w15">
-  <w:p/>
+  <w:p>
+    <w:pPr>
+      <w:pStyle w:val="Header"/>
+      <w:rPr/>
+    </w:pPr>
+    <w:r>
+      <w:rPr/>
+      <w:drawing>
+        <wp:anchor distT="0" distB="0" distL="0" distR="0" simplePos="0" relativeHeight="5" behindDoc="1" locked="0" layoutInCell="0" allowOverlap="1">
+          <wp:simplePos x="0" y="0"/>
+          <wp:positionH relativeFrom="column">
+            <wp:posOffset>1598930</wp:posOffset>
+          </wp:positionH>
+          <wp:positionV relativeFrom="paragraph">
+            <wp:posOffset>-416560</wp:posOffset>
+          </wp:positionV>
+          <wp:extent cx="2877185" cy="629285"/>
+          <wp:effectExtent l="0" t="0" r="0" b="0"/>
+          <wp:wrapSquare wrapText="largest"/>
+          <wp:docPr id="8" name="Image1 Copy 1"/>
+          <wp:cNvGraphicFramePr>
+            <a:graphicFrameLocks xmlns:a="http://schemas.openxmlformats.org/drawingml/2006/main" noChangeAspect="1"/>
+          </wp:cNvGraphicFramePr>
+          <a:graphic xmlns:a="http://schemas.openxmlformats.org/drawingml/2006/main">
+            <a:graphicData uri="http://schemas.openxmlformats.org/drawingml/2006/picture">
+              <pic:pic xmlns:pic="http://schemas.openxmlformats.org/drawingml/2006/picture">
+                <pic:nvPicPr>
+                  <pic:cNvPr id="8" name="Image1 Copy 1"/>
+                  <pic:cNvPicPr>
+                    <a:picLocks noChangeAspect="1" noChangeArrowheads="1"/>
+                  </pic:cNvPicPr>
+                </pic:nvPicPr>
+                <pic:blipFill>
+                  <a:blip r:embed="rId1"/>
+                  <a:stretch>
+                    <a:fillRect/>
+                  </a:stretch>
+                </pic:blipFill>
+                <pic:spPr bwMode="auto">
+                  <a:xfrm>
+                    <a:off x="0" y="0"/>
+                    <a:ext cx="2877185" cy="629285"/>
+                  </a:xfrm>
+                  <a:prstGeom prst="rect">
+                    <a:avLst/>
+                  </a:prstGeom>
+                  <a:noFill/>
+                </pic:spPr>
+              </pic:pic>
+            </a:graphicData>
+          </a:graphic>
+        </wp:anchor>
+      </w:drawing>
+    </w:r>
+  </w:p>
 </w:hdr>
 </file>
 
 <file path=word/numbering.xml><?xml version="1.0" encoding="utf-8"?>
 <w:numbering xmlns:w="http://schemas.openxmlformats.org/wordprocessingml/2006/main" xmlns:o="urn:schemas-microsoft-com:office:office" xmlns:r="http://schemas.openxmlformats.org/officeDocument/2006/relationships" xmlns:v="urn:schemas-microsoft-com:vml" xmlns:mc="http://schemas.openxmlformats.org/markup-compatibility/2006" xmlns:w14="http://schemas.microsoft.com/office/word/2010/wordml" mc:Ignorable="w14">
   <w:abstractNum w:abstractNumId="1">
-    <w:lvl w:ilvl="0">
-      <w:start w:val="1"/>
-      <w:numFmt w:val="none"/>
-      <w:suff w:val="nothing"/>
-      <w:lvlText w:val="%1"/>
-      <w:lvlJc w:val="start"/>
-      <w:pPr>
-        <w:tabs>
-          <w:tab w:val="num" w:pos="0"/>
-        </w:tabs>
-        <w:ind w:start="0" w:hanging="0"/>
-      </w:pPr>
-    </w:lvl>
-    <w:lvl w:ilvl="1">
-      <w:start w:val="1"/>
-      <w:numFmt w:val="none"/>
-      <w:suff w:val="nothing"/>
-      <w:lvlText w:val="%2"/>
-      <w:lvlJc w:val="start"/>
-      <w:pPr>
-        <w:tabs>
-          <w:tab w:val="num" w:pos="0"/>
-        </w:tabs>
-        <w:ind w:start="0" w:hanging="0"/>
-      </w:pPr>
-    </w:lvl>
-    <w:lvl w:ilvl="2">
-      <w:start w:val="1"/>
-      <w:numFmt w:val="none"/>
-      <w:suff w:val="nothing"/>
-      <w:lvlText w:val="%3"/>
-      <w:lvlJc w:val="start"/>
-      <w:pPr>
-        <w:tabs>
-          <w:tab w:val="num" w:pos="0"/>
-        </w:tabs>
-        <w:ind w:start="0" w:hanging="0"/>
-      </w:pPr>
-    </w:lvl>
-    <w:lvl w:ilvl="3">
-      <w:start w:val="1"/>
-      <w:numFmt w:val="none"/>
-      <w:suff w:val="nothing"/>
-      <w:lvlText w:val="%4"/>
-      <w:lvlJc w:val="start"/>
-      <w:pPr>
-        <w:tabs>
-          <w:tab w:val="num" w:pos="0"/>
-        </w:tabs>
-        <w:ind w:start="0" w:hanging="0"/>
-      </w:pPr>
-    </w:lvl>
-    <w:lvl w:ilvl="4">
-      <w:start w:val="1"/>
-      <w:numFmt w:val="none"/>
-      <w:suff w:val="nothing"/>
-      <w:lvlText w:val="%5"/>
-      <w:lvlJc w:val="start"/>
-      <w:pPr>
-        <w:tabs>
-          <w:tab w:val="num" w:pos="0"/>
-        </w:tabs>
-        <w:ind w:start="0" w:hanging="0"/>
-      </w:pPr>
-    </w:lvl>
-    <w:lvl w:ilvl="5">
-      <w:start w:val="1"/>
-      <w:numFmt w:val="none"/>
-      <w:suff w:val="nothing"/>
-      <w:lvlText w:val="%6"/>
-      <w:lvlJc w:val="start"/>
-      <w:pPr>
-        <w:tabs>
-          <w:tab w:val="num" w:pos="0"/>
-        </w:tabs>
-        <w:ind w:start="0" w:hanging="0"/>
-      </w:pPr>
-    </w:lvl>
-    <w:lvl w:ilvl="6">
-      <w:start w:val="1"/>
-      <w:numFmt w:val="none"/>
-      <w:suff w:val="nothing"/>
-      <w:lvlText w:val="%7"/>
-      <w:lvlJc w:val="start"/>
-      <w:pPr>
-        <w:tabs>
-          <w:tab w:val="num" w:pos="0"/>
-        </w:tabs>
-        <w:ind w:start="0" w:hanging="0"/>
-      </w:pPr>
-    </w:lvl>
-    <w:lvl w:ilvl="7">
-      <w:start w:val="1"/>
-      <w:numFmt w:val="none"/>
-      <w:suff w:val="nothing"/>
-      <w:lvlText w:val="%8"/>
-      <w:lvlJc w:val="start"/>
-      <w:pPr>
-        <w:tabs>
-          <w:tab w:val="num" w:pos="0"/>
-        </w:tabs>
-        <w:ind w:start="0" w:hanging="0"/>
-      </w:pPr>
-    </w:lvl>
-    <w:lvl w:ilvl="8">
-      <w:start w:val="1"/>
-      <w:numFmt w:val="none"/>
-      <w:suff w:val="nothing"/>
-      <w:lvlText w:val="%9"/>
-      <w:lvlJc w:val="start"/>
-      <w:pPr>
-        <w:tabs>
-          <w:tab w:val="num" w:pos="0"/>
-        </w:tabs>
-        <w:ind w:start="0" w:hanging="0"/>
-      </w:pPr>
-    </w:lvl>
-  </w:abstractNum>
-  <w:abstractNum w:abstractNumId="2">
     <w:lvl w:ilvl="0">
       <w:start w:val="1"/>
       <w:numFmt w:val="decimal"/>
@@ -3206,260 +3376,123 @@
       </w:rPr>
     </w:lvl>
   </w:abstractNum>
-  <w:abstractNum w:abstractNumId="3">
+  <w:abstractNum w:abstractNumId="2">
     <w:lvl w:ilvl="0">
       <w:start w:val="1"/>
-      <w:numFmt w:val="decimal"/>
-      <w:lvlText w:val="%1."/>
+      <w:numFmt w:val="none"/>
+      <w:suff w:val="nothing"/>
+      <w:lvlText w:val=""/>
       <w:lvlJc w:val="start"/>
       <w:pPr>
         <w:tabs>
           <w:tab w:val="num" w:pos="0"/>
         </w:tabs>
-        <w:ind w:start="720" w:hanging="360"/>
-      </w:pPr>
-      <w:rPr>
-        <w:u w:val="none"/>
-      </w:rPr>
+        <w:ind w:start="0" w:hanging="0"/>
+      </w:pPr>
     </w:lvl>
     <w:lvl w:ilvl="1">
       <w:start w:val="1"/>
-      <w:numFmt w:val="decimal"/>
-      <w:lvlText w:val="%2."/>
+      <w:numFmt w:val="none"/>
+      <w:suff w:val="nothing"/>
+      <w:lvlText w:val=""/>
       <w:lvlJc w:val="start"/>
       <w:pPr>
         <w:tabs>
           <w:tab w:val="num" w:pos="0"/>
         </w:tabs>
-        <w:ind w:start="1440" w:hanging="360"/>
-      </w:pPr>
-      <w:rPr>
-        <w:u w:val="none"/>
-      </w:rPr>
+        <w:ind w:start="0" w:hanging="0"/>
+      </w:pPr>
     </w:lvl>
     <w:lvl w:ilvl="2">
       <w:start w:val="1"/>
-      <w:numFmt w:val="decimal"/>
-      <w:lvlText w:val="%3."/>
+      <w:numFmt w:val="none"/>
+      <w:suff w:val="nothing"/>
+      <w:lvlText w:val=""/>
       <w:lvlJc w:val="start"/>
       <w:pPr>
         <w:tabs>
           <w:tab w:val="num" w:pos="0"/>
         </w:tabs>
-        <w:ind w:start="2160" w:hanging="360"/>
-      </w:pPr>
-      <w:rPr>
-        <w:u w:val="none"/>
-      </w:rPr>
+        <w:ind w:start="0" w:hanging="0"/>
+      </w:pPr>
     </w:lvl>
     <w:lvl w:ilvl="3">
       <w:start w:val="1"/>
-      <w:numFmt w:val="decimal"/>
-      <w:lvlText w:val="%4."/>
+      <w:numFmt w:val="none"/>
+      <w:suff w:val="nothing"/>
+      <w:lvlText w:val=""/>
       <w:lvlJc w:val="start"/>
       <w:pPr>
         <w:tabs>
           <w:tab w:val="num" w:pos="0"/>
         </w:tabs>
-        <w:ind w:start="2880" w:hanging="360"/>
-      </w:pPr>
-      <w:rPr>
-        <w:u w:val="none"/>
-      </w:rPr>
+        <w:ind w:start="0" w:hanging="0"/>
+      </w:pPr>
     </w:lvl>
     <w:lvl w:ilvl="4">
       <w:start w:val="1"/>
-      <w:numFmt w:val="decimal"/>
-      <w:lvlText w:val="%5."/>
+      <w:numFmt w:val="none"/>
+      <w:suff w:val="nothing"/>
+      <w:lvlText w:val=""/>
       <w:lvlJc w:val="start"/>
       <w:pPr>
         <w:tabs>
           <w:tab w:val="num" w:pos="0"/>
         </w:tabs>
-        <w:ind w:start="3600" w:hanging="360"/>
-      </w:pPr>
-      <w:rPr>
-        <w:u w:val="none"/>
-      </w:rPr>
+        <w:ind w:start="0" w:hanging="0"/>
+      </w:pPr>
     </w:lvl>
     <w:lvl w:ilvl="5">
       <w:start w:val="1"/>
-      <w:numFmt w:val="decimal"/>
-      <w:lvlText w:val="%6."/>
+      <w:numFmt w:val="none"/>
+      <w:suff w:val="nothing"/>
+      <w:lvlText w:val=""/>
       <w:lvlJc w:val="start"/>
       <w:pPr>
         <w:tabs>
           <w:tab w:val="num" w:pos="0"/>
         </w:tabs>
-        <w:ind w:start="4320" w:hanging="360"/>
-      </w:pPr>
-      <w:rPr>
-        <w:u w:val="none"/>
-      </w:rPr>
+        <w:ind w:start="0" w:hanging="0"/>
+      </w:pPr>
     </w:lvl>
     <w:lvl w:ilvl="6">
       <w:start w:val="1"/>
-      <w:numFmt w:val="decimal"/>
-      <w:lvlText w:val="%7."/>
+      <w:numFmt w:val="none"/>
+      <w:suff w:val="nothing"/>
+      <w:lvlText w:val=""/>
       <w:lvlJc w:val="start"/>
       <w:pPr>
         <w:tabs>
           <w:tab w:val="num" w:pos="0"/>
         </w:tabs>
-        <w:ind w:start="5040" w:hanging="360"/>
-      </w:pPr>
-      <w:rPr>
-        <w:u w:val="none"/>
-      </w:rPr>
+        <w:ind w:start="0" w:hanging="0"/>
+      </w:pPr>
     </w:lvl>
     <w:lvl w:ilvl="7">
       <w:start w:val="1"/>
-      <w:numFmt w:val="decimal"/>
-      <w:lvlText w:val="%8."/>
+      <w:numFmt w:val="none"/>
+      <w:suff w:val="nothing"/>
+      <w:lvlText w:val=""/>
       <w:lvlJc w:val="start"/>
       <w:pPr>
         <w:tabs>
           <w:tab w:val="num" w:pos="0"/>
         </w:tabs>
-        <w:ind w:start="5760" w:hanging="360"/>
-      </w:pPr>
-      <w:rPr>
-        <w:u w:val="none"/>
-      </w:rPr>
+        <w:ind w:start="0" w:hanging="0"/>
+      </w:pPr>
     </w:lvl>
     <w:lvl w:ilvl="8">
       <w:start w:val="1"/>
-      <w:numFmt w:val="decimal"/>
-      <w:lvlText w:val="%9."/>
+      <w:numFmt w:val="none"/>
+      <w:suff w:val="nothing"/>
+      <w:lvlText w:val=""/>
       <w:lvlJc w:val="start"/>
       <w:pPr>
         <w:tabs>
           <w:tab w:val="num" w:pos="0"/>
         </w:tabs>
-        <w:ind w:start="6480" w:hanging="360"/>
-      </w:pPr>
-      <w:rPr>
-        <w:u w:val="none"/>
-      </w:rPr>
-    </w:lvl>
-  </w:abstractNum>
-  <w:abstractNum w:abstractNumId="4">
-    <w:lvl w:ilvl="0">
-      <w:start w:val="1"/>
-      <w:numFmt w:val="decimal"/>
-      <w:lvlText w:val="%1."/>
-      <w:lvlJc w:val="start"/>
-      <w:pPr>
-        <w:tabs>
-          <w:tab w:val="num" w:pos="720"/>
-        </w:tabs>
-        <w:ind w:start="720" w:hanging="360"/>
-      </w:pPr>
-      <w:rPr/>
-    </w:lvl>
-    <w:lvl w:ilvl="1">
-      <w:start w:val="1"/>
-      <w:numFmt w:val="decimal"/>
-      <w:lvlText w:val="%2."/>
-      <w:lvlJc w:val="start"/>
-      <w:pPr>
-        <w:tabs>
-          <w:tab w:val="num" w:pos="1080"/>
-        </w:tabs>
-        <w:ind w:start="1080" w:hanging="360"/>
-      </w:pPr>
-      <w:rPr/>
-    </w:lvl>
-    <w:lvl w:ilvl="2">
-      <w:start w:val="1"/>
-      <w:numFmt w:val="decimal"/>
-      <w:lvlText w:val="%3."/>
-      <w:lvlJc w:val="start"/>
-      <w:pPr>
-        <w:tabs>
-          <w:tab w:val="num" w:pos="1440"/>
-        </w:tabs>
-        <w:ind w:start="1440" w:hanging="360"/>
-      </w:pPr>
-      <w:rPr/>
-    </w:lvl>
-    <w:lvl w:ilvl="3">
-      <w:start w:val="1"/>
-      <w:numFmt w:val="decimal"/>
-      <w:lvlText w:val="%4."/>
-      <w:lvlJc w:val="start"/>
-      <w:pPr>
-        <w:tabs>
-          <w:tab w:val="num" w:pos="1800"/>
-        </w:tabs>
-        <w:ind w:start="1800" w:hanging="360"/>
-      </w:pPr>
-      <w:rPr/>
-    </w:lvl>
-    <w:lvl w:ilvl="4">
-      <w:start w:val="1"/>
-      <w:numFmt w:val="decimal"/>
-      <w:lvlText w:val="%5."/>
-      <w:lvlJc w:val="start"/>
-      <w:pPr>
-        <w:tabs>
-          <w:tab w:val="num" w:pos="2160"/>
-        </w:tabs>
-        <w:ind w:start="2160" w:hanging="360"/>
-      </w:pPr>
-      <w:rPr/>
-    </w:lvl>
-    <w:lvl w:ilvl="5">
-      <w:start w:val="1"/>
-      <w:numFmt w:val="decimal"/>
-      <w:lvlText w:val="%6."/>
-      <w:lvlJc w:val="start"/>
-      <w:pPr>
-        <w:tabs>
-          <w:tab w:val="num" w:pos="2520"/>
-        </w:tabs>
-        <w:ind w:start="2520" w:hanging="360"/>
-      </w:pPr>
-      <w:rPr/>
-    </w:lvl>
-    <w:lvl w:ilvl="6">
-      <w:start w:val="1"/>
-      <w:numFmt w:val="decimal"/>
-      <w:lvlText w:val="%7."/>
-      <w:lvlJc w:val="start"/>
-      <w:pPr>
-        <w:tabs>
-          <w:tab w:val="num" w:pos="2880"/>
-        </w:tabs>
-        <w:ind w:start="2880" w:hanging="360"/>
-      </w:pPr>
-      <w:rPr/>
-    </w:lvl>
-    <w:lvl w:ilvl="7">
-      <w:start w:val="1"/>
-      <w:numFmt w:val="decimal"/>
-      <w:lvlText w:val="%8."/>
-      <w:lvlJc w:val="start"/>
-      <w:pPr>
-        <w:tabs>
-          <w:tab w:val="num" w:pos="3240"/>
-        </w:tabs>
-        <w:ind w:start="3240" w:hanging="360"/>
-      </w:pPr>
-      <w:rPr/>
-    </w:lvl>
-    <w:lvl w:ilvl="8">
-      <w:start w:val="1"/>
-      <w:numFmt w:val="decimal"/>
-      <w:lvlText w:val="%9."/>
-      <w:lvlJc w:val="start"/>
-      <w:pPr>
-        <w:tabs>
-          <w:tab w:val="num" w:pos="3600"/>
-        </w:tabs>
-        <w:ind w:start="3600" w:hanging="360"/>
-      </w:pPr>
-      <w:rPr/>
+        <w:ind w:start="0" w:hanging="0"/>
+      </w:pPr>
     </w:lvl>
   </w:abstractNum>
   <w:num w:numId="1">
@@ -3467,12 +3500,6 @@
   </w:num>
   <w:num w:numId="2">
     <w:abstractNumId w:val="2"/>
-  </w:num>
-  <w:num w:numId="3">
-    <w:abstractNumId w:val="3"/>
-  </w:num>
-  <w:num w:numId="4">
-    <w:abstractNumId w:val="4"/>
   </w:num>
 </w:numbering>
 </file>
@@ -3500,9 +3527,7 @@
     <w:pPr>
       <w:widowControl/>
       <w:suppressAutoHyphens w:val="true"/>
-      <w:kinsoku w:val="true"/>
       <w:overflowPunct w:val="true"/>
-      <w:autoSpaceDE w:val="true"/>
       <w:bidi w:val="0"/>
       <w:spacing w:lineRule="auto" w:line="276" w:before="0" w:after="0"/>
       <w:jc w:val="start"/>
@@ -3784,6 +3809,16 @@
     </w:pPr>
     <w:rPr/>
   </w:style>
+  <w:style w:type="paragraph" w:styleId="TableContents">
+    <w:name w:val="Table Contents"/>
+    <w:basedOn w:val="Normal"/>
+    <w:qFormat/>
+    <w:pPr>
+      <w:widowControl w:val="false"/>
+      <w:suppressLineNumbers/>
+    </w:pPr>
+    <w:rPr/>
+  </w:style>
   <w:style w:type="numbering" w:styleId="NoList">
     <w:name w:val="No List"/>
     <w:qFormat/>

</xml_diff>